<commit_message>
Regenerate core tester test plan with lowercase brand wording
</commit_message>
<xml_diff>
--- a/downloads/knokkeroo-tester-test-plan-core.docx
+++ b/downloads/knokkeroo-tester-test-plan-core.docx
@@ -116,7 +116,7 @@
           </w:tcPr>
           <w:p>
             <w:r>
-              <w:t>30 July 2026</w:t>
+              <w:t>31 July 2026</w:t>
             </w:r>
           </w:p>
         </w:tc>
@@ -744,7 +744,7 @@
               <w:rPr>
                 <w:sz w:val="18"/>
               </w:rPr>
-              <w:t>Knok updates your own last-checked-in time immediately.</w:t>
+              <w:t>knok updates your own last-checked-in time immediately.</w:t>
               <w:br/>
               <w:t>Preconditions: logged in, on the home screen.</w:t>
             </w:r>
@@ -761,7 +761,7 @@
               </w:rPr>
               <w:t>1. Tap your own Me tile.</w:t>
               <w:br/>
-              <w:t>2. Tap Knok.</w:t>
+              <w:t>2. Tap knok.</w:t>
               <w:br/>
               <w:t>3. Return to the home screen.</w:t>
             </w:r>

</xml_diff>